<commit_message>
📈 Add RFM and Cohort Analysis
</commit_message>
<xml_diff>
--- a/Food_delivery_analytics_report.docx
+++ b/Food_delivery_analytics_report.docx
@@ -2194,34 +2194,14 @@
                 <w:szCs w:val="28"/>
               </w:rPr>
             </w:pPr>
-            <w:proofErr w:type="spellStart"/>
             <w:r>
               <w:rPr>
                 <w:sz w:val="28"/>
                 <w:szCs w:val="28"/>
                 <w:lang w:val="en-US"/>
               </w:rPr>
-              <w:t>Potential</w:t>
+              <w:t>Potential Loyalists</w:t>
             </w:r>
-            <w:proofErr w:type="spellEnd"/>
-            <w:r>
-              <w:rPr>
-                <w:sz w:val="28"/>
-                <w:szCs w:val="28"/>
-                <w:lang w:val="en-US"/>
-              </w:rPr>
-              <w:t xml:space="preserve"> </w:t>
-            </w:r>
-            <w:proofErr w:type="spellStart"/>
-            <w:r>
-              <w:rPr>
-                <w:sz w:val="28"/>
-                <w:szCs w:val="28"/>
-                <w:lang w:val="en-US"/>
-              </w:rPr>
-              <w:t>Loyalists</w:t>
-            </w:r>
-            <w:proofErr w:type="spellEnd"/>
           </w:p>
         </w:tc>
         <w:tc>
@@ -2503,31 +2483,23 @@
           <w:szCs w:val="28"/>
           <w:shd w:val="clear" w:color="auto" w:fill="FFFFFF"/>
         </w:rPr>
-        <w:t xml:space="preserve"> </w:t>
-      </w:r>
-      <w:r>
+        <w:t xml:space="preserve"> – это 35% клиентов, которые уже знакомы с сервисом, но перестали заказывать. Их возврат может дать значительный прирост выручки без дополнительных затрат на привлечение.</w:t>
+      </w:r>
+    </w:p>
+    <w:p>
+      <w:pPr>
+        <w:shd w:val="clear" w:color="auto" w:fill="FFFFFF"/>
+        <w:spacing w:after="0" w:line="360" w:lineRule="auto"/>
+        <w:jc w:val="both"/>
         <w:rPr>
           <w:rFonts w:ascii="Times New Roman" w:hAnsi="Times New Roman" w:cs="Times New Roman"/>
           <w:sz w:val="28"/>
           <w:szCs w:val="28"/>
           <w:shd w:val="clear" w:color="auto" w:fill="FFFFFF"/>
         </w:rPr>
-        <w:t>– это 35% клиентов, которые уже знакомы с сервисом, но перестали заказывать. Их возврат может дать значительный прирост выручки без дополнительных затрат на привлечение.</w:t>
-      </w:r>
-    </w:p>
-    <w:p>
-      <w:pPr>
-        <w:shd w:val="clear" w:color="auto" w:fill="FFFFFF"/>
-        <w:spacing w:after="0" w:line="360" w:lineRule="auto"/>
-        <w:ind w:firstLine="709"/>
-        <w:jc w:val="both"/>
-        <w:rPr>
-          <w:rFonts w:ascii="Times New Roman" w:hAnsi="Times New Roman" w:cs="Times New Roman"/>
-          <w:sz w:val="28"/>
-          <w:szCs w:val="28"/>
-          <w:shd w:val="clear" w:color="auto" w:fill="FFFFFF"/>
-        </w:rPr>
-      </w:pPr>
+      </w:pPr>
+      <w:bookmarkStart w:id="0" w:name="_GoBack"/>
+      <w:bookmarkEnd w:id="0"/>
     </w:p>
     <w:p>
       <w:pPr>
@@ -3422,14 +3394,7 @@
           <w:sz w:val="28"/>
           <w:szCs w:val="28"/>
         </w:rPr>
-        <w:t xml:space="preserve"> </w:t>
-      </w:r>
-      <w:r>
-        <w:rPr>
-          <w:sz w:val="28"/>
-          <w:szCs w:val="28"/>
-        </w:rPr>
-        <w:t xml:space="preserve">запустить </w:t>
+        <w:t xml:space="preserve"> запустить </w:t>
       </w:r>
       <w:proofErr w:type="spellStart"/>
       <w:r>
@@ -3509,14 +3474,7 @@
           <w:sz w:val="28"/>
           <w:szCs w:val="28"/>
         </w:rPr>
-        <w:t xml:space="preserve"> </w:t>
-      </w:r>
-      <w:r>
-        <w:rPr>
-          <w:sz w:val="28"/>
-          <w:szCs w:val="28"/>
-        </w:rPr>
-        <w:t>пересмотреть политику найма курьеров и внедрить гибкие графики – это снизит операционные расходы на 15–20%.</w:t>
+        <w:t xml:space="preserve"> пересмотреть политику найма курьеров и внедрить гибкие графики – это снизит операционные расходы на 15–20%.</w:t>
       </w:r>
     </w:p>
     <w:p>
@@ -3558,14 +3516,7 @@
           <w:sz w:val="28"/>
           <w:szCs w:val="28"/>
         </w:rPr>
-        <w:t xml:space="preserve"> </w:t>
-      </w:r>
-      <w:r>
-        <w:rPr>
-          <w:sz w:val="28"/>
-          <w:szCs w:val="28"/>
-        </w:rPr>
-        <w:t>укрепить партнёрства с ресторанами популярных кухонь и улучшить сервис в городах с низким рейтингом.</w:t>
+        <w:t xml:space="preserve"> укрепить партнёрства с ресторанами популярных кухонь и улучшить сервис в городах с низким рейтингом.</w:t>
       </w:r>
     </w:p>
     <w:p>
@@ -3686,8 +3637,6 @@
         </w:rPr>
         <w:t>». Реализация предложенных рекомендаций позволит не только сохранить текущие темпы роста, но и повысить операционную эффективность бизнеса.</w:t>
       </w:r>
-      <w:bookmarkStart w:id="0" w:name="_GoBack"/>
-      <w:bookmarkEnd w:id="0"/>
     </w:p>
     <w:sectPr>
       <w:pgSz w:w="11906" w:h="16838"/>

</xml_diff>